<commit_message>
M16: regenerate northgate-staffing under the wave's knobs (baseline + noise; the exemplar)
Wholesale regen through the live airlock (claude-opus-4-8[1m], xhigh). The
exemplar finally carries the wave's fixes: business_calendar (0 weekend
meetings, the cited Saturday 2016-05-28 and 2023-07-04 sessions gone),
book_is_sample (overview no longer claims the whole book), style_specs (12
specs) + voice_diversify, and organizational noise (13 derived: copies,
drafts, diverging version chains, a misfile, a dead template, empty dirs,
decorated filenames). Validates clean (27 rules, NOISE-01/CAL-01 run, 0
errors); self-scores 100%; byte-pin re-derives; org-tier green.
</commit_message>
<xml_diff>
--- a/companies/northgate-staffing/Engagements/Coleman Ltd/2016.03.09 - Kickoff Memo - VP Engineering Search.docx
+++ b/companies/northgate-staffing/Engagements/Coleman Ltd/2016.03.09 - Kickoff Memo - VP Engineering Search.docx
@@ -8,17 +8,17 @@
         <w:br/>
         <w:t>From: Jeffrey Patterson</w:t>
         <w:br/>
-        <w:t>Re: VP Engineering search, working plan</w:t>
+        <w:t>Re: Kickoff — Vice President of Engineering search for Coleman Ltd</w:t>
       </w:r>
     </w:p>
     <w:p>
       <w:r>
-        <w:t>The engagement letter is signed and the search for Coleman Ltd commences on March 6, 2016. This memo is the plan of record. The objective, stated once so that we can be held to it: place a Vice President of Engineering at Coleman Ltd who can run the engineering organization through the next stage of its growth and who is still there in three years. Michael Martin, their Chief Operating Officer, is the hiring executive and our single point of contact. The role reports to him.</w:t>
+        <w:t>Our goal for this search is simple to state: to place a Vice President of Engineering that Coleman Ltd is glad to have hired a year from now. Everything below serves that end, and I have kept the memo short so it is easy to hold in mind. The engagement opened on March 6, 2016, and this note sets out how we will run the early weeks so that we start clean and stay aligned. Our client sponsor is Michael Martin, and he has asked to be the single point of contact on Coleman's side, which keeps our reporting simple and our messages from crossing.</w:t>
       </w:r>
     </w:p>
     <w:p>
       <w:r>
-        <w:t>Two things about this assignment that I want on the record at the start, because they will be less comfortable to say in week ten. First, we do not yet know what the client wants. We know what the job description says, which is not the same thing, and the intake interviews exist to find the distance between the two. Second, this profile is not deep in this market. I would rather write that sentence now than discover it halfway through the slate.</w:t>
+        <w:t>A word before the work. We do not yet know this organization as well as we will, and the kickoff conversation is where that starts. Michael Martin has offered us his time early, and we should use it to understand the shape of the team the new leader will inherit and the decisions waiting for them. Hold your questions for that session rather than assuming; the brief is only ever as good as what we learn there.</w:t>
       </w:r>
     </w:p>
     <w:p>
@@ -26,7 +26,7 @@
         <w:pStyle w:val="Heading2"/>
       </w:pPr>
       <w:r>
-        <w:t>Workstreams</w:t>
+        <w:t>The early work</w:t>
       </w:r>
     </w:p>
     <w:p>
@@ -34,7 +34,7 @@
         <w:pStyle w:val="ListBullet"/>
       </w:pPr>
       <w:r>
-        <w:t>Intake and specification. Owner: me. Interviews with Michael Martin and with everyone the role touches, then a written position specification back to the client for signature. Nothing gets sourced against an unsigned specification, including by me.</w:t>
+        <w:t>Market map. John Chang will chart the engineering-leadership market and identify the pools worth working, reaching into adjacent sectors where the relevant experience also sits.</w:t>
       </w:r>
     </w:p>
     <w:p>
@@ -42,7 +42,7 @@
         <w:pStyle w:val="ListBullet"/>
       </w:pPr>
       <w:r>
-        <w:t>Market map. Owner: John Chang, with me. Target company list first, name list second. John, build the company list before you build the name list. I want us arguing about which companies are in bounds before we are arguing about which people are.</w:t>
+        <w:t>Specification. James Grant and I will turn the kickoff conversation into a written brief we can hold the search to, and circulate it for the client's sign-off before we approach anyone.</w:t>
       </w:r>
     </w:p>
     <w:p>
@@ -50,7 +50,7 @@
         <w:pStyle w:val="ListBullet"/>
       </w:pPr>
       <w:r>
-        <w:t>Client relationship. Owner: James Grant. Jim owns the temperature reading, which is the thing no document will tell us: whether they will actually hire, who else has a vote we have not been told about, and what the internal candidate situation is. There is always an internal candidate situation.</w:t>
+        <w:t>Sourcing. Once the map and the brief are set, we begin discreet approaches, describing the role rather than naming the people we speak with.</w:t>
       </w:r>
     </w:p>
     <w:p>
@@ -58,7 +58,7 @@
         <w:pStyle w:val="ListBullet"/>
       </w:pPr>
       <w:r>
-        <w:t>Candidate development. Owners: James Grant and me. Jim makes the first call to anyone senior; the people we want are employed and will take a call from a person before they will take one from a firm.</w:t>
+        <w:t>Confidentiality. We write about candidates by their current seat, not their name, in anything that leaves the room, and we will ask the client to do the same.</w:t>
       </w:r>
     </w:p>
     <w:p>
@@ -66,20 +66,12 @@
         <w:pStyle w:val="ListBullet"/>
       </w:pPr>
       <w:r>
-        <w:t>Records and discretion. Owner: John Chang. Candidates go into the file and into anything that circulates by current role, not by name, from the first entry rather than from the first time it matters. This is easy to do from the start and impossible to retrofit.</w:t>
-      </w:r>
-    </w:p>
-    <w:p>
-      <w:pPr>
-        <w:pStyle w:val="ListBullet"/>
-      </w:pPr>
-      <w:r>
-        <w:t>Weekly written update to the client. Owner: me, with Jim's read attached to it. It goes every week whether or not there is news, because a week of silence from a retained firm is read as a week of nothing happening.</w:t>
+        <w:t>Cadence. We will hold a short internal review each week and send the client a written update on a steady rhythm, so no one has to ask where things stand.</w:t>
       </w:r>
     </w:p>
     <w:p>
       <w:r>
-        <w:t>On sequencing: the calibration session is the cheapest thing we will do and the most valuable. Its whole purpose is to let the client be wrong in front of us, early, about a profile that costs nothing, rather than in front of a candidate, late, about a profile that costs the assignment. Do not let it get postponed for a busy week. If it slips twice, that is information about the client and I want to hear about it.</w:t>
+        <w:t>None of these steps is complicated on its own. What makes a search succeed is doing them in order and not skipping ahead: a map before a list, a list before an approach, an approach before a slate. If we hold that discipline, and keep Michael Martin informed as we go, the rest tends to take care of itself.</w:t>
       </w:r>
     </w:p>
     <w:p>
@@ -87,52 +79,17 @@
         <w:pStyle w:val="Heading2"/>
       </w:pPr>
       <w:r>
-        <w:t>Next Steps</w:t>
-      </w:r>
-    </w:p>
-    <w:p>
-      <w:pPr>
-        <w:pStyle w:val="ListBullet"/>
-      </w:pPr>
-      <w:r>
-        <w:t>Intake interviews with Michael Martin inside the first week. I will send times today.</w:t>
-      </w:r>
-    </w:p>
-    <w:p>
-      <w:pPr>
-        <w:pStyle w:val="ListBullet"/>
-      </w:pPr>
-      <w:r>
-        <w:t>Jim to get us the reporting chart and the compensation band, and to find out who at Coleman Ltd besides our contact has a say in this.</w:t>
-      </w:r>
-    </w:p>
-    <w:p>
-      <w:pPr>
-        <w:pStyle w:val="ListBullet"/>
-      </w:pPr>
-      <w:r>
-        <w:t>John to have the target company list in front of me by the end of week two.</w:t>
-      </w:r>
-    </w:p>
-    <w:p>
-      <w:pPr>
-        <w:pStyle w:val="ListBullet"/>
-      </w:pPr>
-      <w:r>
-        <w:t>Draft position specification to the client at the end of week three.</w:t>
-      </w:r>
-    </w:p>
-    <w:p>
-      <w:pPr>
-        <w:pStyle w:val="ListBullet"/>
-      </w:pPr>
-      <w:r>
-        <w:t>Standing team call weekly. Fifteen minutes when there is nothing, and longer when there is.</w:t>
+        <w:t>This week</w:t>
       </w:r>
     </w:p>
     <w:p>
       <w:r>
-        <w:t>One note on tone. Everything we send this client is also a sample of how we work, and they have no other sample yet. Reread it before it goes.</w:t>
+        <w:t>Before anything else, John Chang will circulate a first cut of the market map for James Grant and me to react to. I will confirm the kickoff notes with Michael Martin and lock the specification review for early next week. A good brief for this role names the two or three outcomes the new leader has to deliver in the first year, not a wish list of traits; keep that test in mind as you shape it. If either of you sees a gap in the brief as it stands, raise it now. Correcting the brief is cheap while it is still on paper, and I would like us to open the approaches with it fully settled.</w:t>
+      </w:r>
+    </w:p>
+    <w:p>
+      <w:r>
+        <w:t>The single thing that has to happen first is the market map. Everything we do after it depends on it, so let us get a first version in front of ourselves by Friday and build from there.</w:t>
       </w:r>
     </w:p>
     <w:sectPr>

</xml_diff>